<commit_message>
submission at ecology letters
</commit_message>
<xml_diff>
--- a/drafts/pnas:ecolets/PNAS/Miller-terKuile_pjay_Jan2026.docx
+++ b/drafts/pnas:ecolets/PNAS/Miller-terKuile_pjay_Jan2026.docx
@@ -12334,23 +12334,7 @@
       </w:r>
       <w:r>
         <w:tab/>
-        <w:t xml:space="preserve">A. Miller-ter Kuile, A. Wion, K. Rodman, J. Sanderlin, K. Ogle, </w:t>
-      </w:r>
-      <w:proofErr w:type="spellStart"/>
-      <w:r>
-        <w:t>anamtk</w:t>
-      </w:r>
-      <w:proofErr w:type="spellEnd"/>
-      <w:r>
-        <w:t>/</w:t>
-      </w:r>
-      <w:proofErr w:type="spellStart"/>
-      <w:r>
-        <w:t>pinyon_jay_archive</w:t>
-      </w:r>
-      <w:proofErr w:type="spellEnd"/>
-      <w:r>
-        <w:t>: v1. (2026). https://doi.org/10.5281/ZENODO.18343362. Deposited 22 January 2026.</w:t>
+        <w:t>A. Miller-ter Kuile, A. Wion, K. Rodman, J. Sanderlin, K. Ogle, anamtk/pinyon_jay_archive: v1. (2026). https://doi.org/10.5281/ZENODO.18343362. Deposited 22 January 2026.</w:t>
       </w:r>
     </w:p>
     <w:p>
@@ -12362,23 +12346,7 @@
       </w:r>
       <w:r>
         <w:tab/>
-        <w:t xml:space="preserve">C. Finn, F. </w:t>
-      </w:r>
-      <w:proofErr w:type="spellStart"/>
-      <w:r>
-        <w:t>Grattarola</w:t>
-      </w:r>
-      <w:proofErr w:type="spellEnd"/>
-      <w:r>
-        <w:t xml:space="preserve">, D. Pincheira‐Donoso, </w:t>
-      </w:r>
-      <w:proofErr w:type="gramStart"/>
-      <w:r>
-        <w:t>More</w:t>
-      </w:r>
-      <w:proofErr w:type="gramEnd"/>
-      <w:r>
-        <w:t xml:space="preserve"> losers than winners: investigating Anthropocene defaunation through the diversity of population trends. </w:t>
+        <w:t xml:space="preserve">C. Finn, F. Grattarola, D. Pincheira‐Donoso, More losers than winners: investigating Anthropocene defaunation through the diversity of population trends. </w:t>
       </w:r>
       <w:r>
         <w:rPr>
@@ -12412,31 +12380,13 @@
         <w:tab/>
         <w:t xml:space="preserve">A. S. Hogue, K. Breon, The greatest threats to species. </w:t>
       </w:r>
-      <w:proofErr w:type="spellStart"/>
-      <w:r>
-        <w:rPr>
-          <w:i/>
-          <w:iCs/>
-        </w:rPr>
-        <w:t>Conservat</w:t>
-      </w:r>
-      <w:proofErr w:type="spellEnd"/>
-      <w:r>
-        <w:rPr>
-          <w:i/>
-          <w:iCs/>
-        </w:rPr>
-        <w:t xml:space="preserve"> Sci and </w:t>
-      </w:r>
-      <w:proofErr w:type="spellStart"/>
-      <w:r>
-        <w:rPr>
-          <w:i/>
-          <w:iCs/>
-        </w:rPr>
-        <w:t>Prac</w:t>
-      </w:r>
-      <w:proofErr w:type="spellEnd"/>
+      <w:r>
+        <w:rPr>
+          <w:i/>
+          <w:iCs/>
+        </w:rPr>
+        <w:t>Conservat Sci and Prac</w:t>
+      </w:r>
       <w:r>
         <w:t xml:space="preserve"> </w:t>
       </w:r>
@@ -12460,15 +12410,7 @@
       </w:r>
       <w:r>
         <w:tab/>
-        <w:t xml:space="preserve">P. </w:t>
-      </w:r>
-      <w:proofErr w:type="spellStart"/>
-      <w:r>
-        <w:t>Jaureguiberry</w:t>
-      </w:r>
-      <w:proofErr w:type="spellEnd"/>
-      <w:r>
-        <w:t xml:space="preserve">, </w:t>
+        <w:t xml:space="preserve">P. Jaureguiberry, </w:t>
       </w:r>
       <w:r>
         <w:rPr>
@@ -12510,23 +12452,7 @@
       </w:r>
       <w:r>
         <w:tab/>
-        <w:t xml:space="preserve">D. D’Alelio, B. Hay Mele, S. </w:t>
-      </w:r>
-      <w:proofErr w:type="spellStart"/>
-      <w:r>
-        <w:t>Libralato</w:t>
-      </w:r>
-      <w:proofErr w:type="spellEnd"/>
-      <w:r>
-        <w:t xml:space="preserve">, M. Ribera </w:t>
-      </w:r>
-      <w:proofErr w:type="spellStart"/>
-      <w:r>
-        <w:t>d’Alcalà</w:t>
-      </w:r>
-      <w:proofErr w:type="spellEnd"/>
-      <w:r>
-        <w:t xml:space="preserve">, F. Jordán, Rewiring and indirect effects underpin modularity reshuffling in a marine food web under environmental shifts. </w:t>
+        <w:t xml:space="preserve">D. D’Alelio, B. Hay Mele, S. Libralato, M. Ribera d’Alcalà, F. Jordán, Rewiring and indirect effects underpin modularity reshuffling in a marine food web under environmental shifts. </w:t>
       </w:r>
       <w:r>
         <w:rPr>
@@ -12667,31 +12593,13 @@
       <w:r>
         <w:t xml:space="preserve">, Beyond species loss: the extinction of ecological interactions in a changing world. </w:t>
       </w:r>
-      <w:proofErr w:type="spellStart"/>
-      <w:r>
-        <w:rPr>
-          <w:i/>
-          <w:iCs/>
-        </w:rPr>
-        <w:t>Funct</w:t>
-      </w:r>
-      <w:proofErr w:type="spellEnd"/>
-      <w:r>
-        <w:rPr>
-          <w:i/>
-          <w:iCs/>
-        </w:rPr>
-        <w:t xml:space="preserve"> </w:t>
-      </w:r>
-      <w:proofErr w:type="spellStart"/>
-      <w:r>
-        <w:rPr>
-          <w:i/>
-          <w:iCs/>
-        </w:rPr>
-        <w:t>Ecol</w:t>
-      </w:r>
-      <w:proofErr w:type="spellEnd"/>
+      <w:r>
+        <w:rPr>
+          <w:i/>
+          <w:iCs/>
+        </w:rPr>
+        <w:t>Funct Ecol</w:t>
+      </w:r>
       <w:r>
         <w:t xml:space="preserve"> </w:t>
       </w:r>
@@ -12757,15 +12665,7 @@
       </w:r>
       <w:r>
         <w:tab/>
-        <w:t xml:space="preserve">J. Elith, J. R. </w:t>
-      </w:r>
-      <w:proofErr w:type="spellStart"/>
-      <w:r>
-        <w:t>Leathwick</w:t>
-      </w:r>
-      <w:proofErr w:type="spellEnd"/>
-      <w:r>
-        <w:t xml:space="preserve">, Species Distribution Models: Ecological Explanation and Prediction Across Space and Time. </w:t>
+        <w:t xml:space="preserve">J. Elith, J. R. Leathwick, Species Distribution Models: Ecological Explanation and Prediction Across Space and Time. </w:t>
       </w:r>
       <w:r>
         <w:rPr>
@@ -12797,23 +12697,7 @@
       </w:r>
       <w:r>
         <w:tab/>
-        <w:t xml:space="preserve">R. J. </w:t>
-      </w:r>
-      <w:proofErr w:type="spellStart"/>
-      <w:r>
-        <w:t>Hijmans</w:t>
-      </w:r>
-      <w:proofErr w:type="spellEnd"/>
-      <w:r>
-        <w:t xml:space="preserve">, C. H. Graham, </w:t>
-      </w:r>
-      <w:proofErr w:type="gramStart"/>
-      <w:r>
-        <w:t>The</w:t>
-      </w:r>
-      <w:proofErr w:type="gramEnd"/>
-      <w:r>
-        <w:t xml:space="preserve"> ability of climate envelope models to predict the effect of climate change on species distributions. </w:t>
+        <w:t xml:space="preserve">R. J. Hijmans, C. H. Graham, The ability of climate envelope models to predict the effect of climate change on species distributions. </w:t>
       </w:r>
       <w:r>
         <w:rPr>
@@ -12919,17 +12803,8 @@
       </w:r>
       <w:r>
         <w:tab/>
-        <w:t xml:space="preserve">J. A. Lee‐Yaw, J. L. McCune, S. </w:t>
-      </w:r>
-      <w:proofErr w:type="spellStart"/>
-      <w:r>
-        <w:t>Pironon</w:t>
-      </w:r>
-      <w:proofErr w:type="spellEnd"/>
-      <w:r>
-        <w:t xml:space="preserve">, S. N. Sheth, Species distribution models rarely predict the biology of real populations. </w:t>
-      </w:r>
-      <w:proofErr w:type="spellStart"/>
+        <w:t xml:space="preserve">J. A. Lee‐Yaw, J. L. McCune, S. Pironon, S. N. Sheth, Species distribution models rarely predict the biology of real populations. </w:t>
+      </w:r>
       <w:r>
         <w:rPr>
           <w:i/>
@@ -12937,7 +12812,6 @@
         </w:rPr>
         <w:t>Ecography</w:t>
       </w:r>
-      <w:proofErr w:type="spellEnd"/>
       <w:r>
         <w:t xml:space="preserve"> </w:t>
       </w:r>
@@ -12961,15 +12835,7 @@
       </w:r>
       <w:r>
         <w:tab/>
-        <w:t xml:space="preserve">P. J. </w:t>
-      </w:r>
-      <w:proofErr w:type="spellStart"/>
-      <w:r>
-        <w:t>CaraDonna</w:t>
-      </w:r>
-      <w:proofErr w:type="spellEnd"/>
-      <w:r>
-        <w:t xml:space="preserve">, </w:t>
+        <w:t xml:space="preserve">P. J. CaraDonna, </w:t>
       </w:r>
       <w:r>
         <w:rPr>
@@ -13011,23 +12877,7 @@
       </w:r>
       <w:r>
         <w:tab/>
-        <w:t xml:space="preserve">T. </w:t>
-      </w:r>
-      <w:proofErr w:type="spellStart"/>
-      <w:r>
-        <w:t>Poisot</w:t>
-      </w:r>
-      <w:proofErr w:type="spellEnd"/>
-      <w:r>
-        <w:t xml:space="preserve">, D. B. Stouffer, D. Gravel, </w:t>
-      </w:r>
-      <w:proofErr w:type="gramStart"/>
-      <w:r>
-        <w:t>Beyond</w:t>
-      </w:r>
-      <w:proofErr w:type="gramEnd"/>
-      <w:r>
-        <w:t xml:space="preserve"> species: why ecological interaction networks vary through space and time. </w:t>
+        <w:t xml:space="preserve">T. Poisot, D. B. Stouffer, D. Gravel, Beyond species: why ecological interaction networks vary through space and time. </w:t>
       </w:r>
       <w:r>
         <w:rPr>
@@ -13113,21 +12963,12 @@
       <w:r>
         <w:t xml:space="preserve">, Quantifying ecological memory in plant and ecosystem processes. </w:t>
       </w:r>
-      <w:proofErr w:type="spellStart"/>
-      <w:r>
-        <w:rPr>
-          <w:i/>
-          <w:iCs/>
-        </w:rPr>
-        <w:t>Ecol</w:t>
-      </w:r>
-      <w:proofErr w:type="spellEnd"/>
-      <w:r>
-        <w:rPr>
-          <w:i/>
-          <w:iCs/>
-        </w:rPr>
-        <w:t xml:space="preserve"> Lett</w:t>
+      <w:r>
+        <w:rPr>
+          <w:i/>
+          <w:iCs/>
+        </w:rPr>
+        <w:t>Ecol Lett</w:t>
       </w:r>
       <w:r>
         <w:t xml:space="preserve"> </w:t>
@@ -13152,15 +12993,7 @@
       </w:r>
       <w:r>
         <w:tab/>
-        <w:t xml:space="preserve">J. Padisak, Seasonal Succession of Phytoplankton in a Large Shallow Lake (Balaton, </w:t>
-      </w:r>
-      <w:proofErr w:type="gramStart"/>
-      <w:r>
-        <w:t>Hungary)--</w:t>
-      </w:r>
-      <w:proofErr w:type="gramEnd"/>
-      <w:r>
-        <w:t xml:space="preserve">A Dynamic Approach to Ecological Memory, Its Possible Role and Mechanisms. </w:t>
+        <w:t xml:space="preserve">J. Padisak, Seasonal Succession of Phytoplankton in a Large Shallow Lake (Balaton, Hungary)--A Dynamic Approach to Ecological Memory, Its Possible Role and Mechanisms. </w:t>
       </w:r>
       <w:r>
         <w:rPr>
@@ -13267,23 +13100,7 @@
       </w:r>
       <w:r>
         <w:tab/>
-        <w:t xml:space="preserve">M. Bogdziewicz, E. E. Crone, R. Zwolak, </w:t>
-      </w:r>
-      <w:proofErr w:type="gramStart"/>
-      <w:r>
-        <w:t>Do</w:t>
-      </w:r>
-      <w:proofErr w:type="gramEnd"/>
-      <w:r>
-        <w:t xml:space="preserve"> benefits of seed dispersal and caching by </w:t>
-      </w:r>
-      <w:proofErr w:type="spellStart"/>
-      <w:r>
-        <w:t>scatterhoarders</w:t>
-      </w:r>
-      <w:proofErr w:type="spellEnd"/>
-      <w:r>
-        <w:t xml:space="preserve"> outweigh the costs of predation? An example with oaks and yellow‐necked mice. </w:t>
+        <w:t xml:space="preserve">M. Bogdziewicz, E. E. Crone, R. Zwolak, Do benefits of seed dispersal and caching by scatterhoarders outweigh the costs of predation? An example with oaks and yellow‐necked mice. </w:t>
       </w:r>
       <w:r>
         <w:rPr>
@@ -13315,15 +13132,7 @@
       </w:r>
       <w:r>
         <w:tab/>
-        <w:t xml:space="preserve">C. M. Moore, J. W. Dittel, </w:t>
-      </w:r>
-      <w:proofErr w:type="gramStart"/>
-      <w:r>
-        <w:t>On</w:t>
-      </w:r>
-      <w:proofErr w:type="gramEnd"/>
-      <w:r>
-        <w:t xml:space="preserve"> mutualism, models, and masting: The effects of seed‐dispersing animals on the plants they disperse. </w:t>
+        <w:t xml:space="preserve">C. M. Moore, J. W. Dittel, On mutualism, models, and masting: The effects of seed‐dispersing animals on the plants they disperse. </w:t>
       </w:r>
       <w:r>
         <w:rPr>
@@ -13355,15 +13164,7 @@
       </w:r>
       <w:r>
         <w:tab/>
-        <w:t xml:space="preserve">G. M. Sawaya, A. S. Goldberg, M. A. Steele, H. J. Dalgleish, Environmental variation shifts the relationship between trees and </w:t>
-      </w:r>
-      <w:proofErr w:type="spellStart"/>
-      <w:r>
-        <w:t>scatterhoarders</w:t>
-      </w:r>
-      <w:proofErr w:type="spellEnd"/>
-      <w:r>
-        <w:t xml:space="preserve"> along the continuum from mutualism to antagonism. </w:t>
+        <w:t xml:space="preserve">G. M. Sawaya, A. S. Goldberg, M. A. Steele, H. J. Dalgleish, Environmental variation shifts the relationship between trees and scatterhoarders along the continuum from mutualism to antagonism. </w:t>
       </w:r>
       <w:r>
         <w:rPr>
@@ -13479,15 +13280,7 @@
       </w:r>
       <w:r>
         <w:tab/>
-        <w:t xml:space="preserve">I. S. Pearse, W. D. Koenig, D. Kelly, Mechanisms of mast </w:t>
-      </w:r>
-      <w:proofErr w:type="gramStart"/>
-      <w:r>
-        <w:t>seeding:</w:t>
-      </w:r>
-      <w:proofErr w:type="gramEnd"/>
-      <w:r>
-        <w:t xml:space="preserve"> resources, weather, cues, and selection. </w:t>
+        <w:t xml:space="preserve">I. S. Pearse, W. D. Koenig, D. Kelly, Mechanisms of mast seeding: resources, weather, cues, and selection. </w:t>
       </w:r>
       <w:r>
         <w:rPr>
@@ -13647,7 +13440,6 @@
       <w:r>
         <w:t xml:space="preserve">, Demography of alpine red squirrel populations in relation to fluctuations in seed crop size. </w:t>
       </w:r>
-      <w:proofErr w:type="spellStart"/>
       <w:r>
         <w:rPr>
           <w:i/>
@@ -13655,7 +13447,6 @@
         </w:rPr>
         <w:t>Ecography</w:t>
       </w:r>
-      <w:proofErr w:type="spellEnd"/>
       <w:r>
         <w:t xml:space="preserve"> </w:t>
       </w:r>
@@ -13679,15 +13470,7 @@
       </w:r>
       <w:r>
         <w:tab/>
-        <w:t xml:space="preserve">M. B. </w:t>
-      </w:r>
-      <w:proofErr w:type="spellStart"/>
-      <w:r>
-        <w:t>Pesendorfer</w:t>
-      </w:r>
-      <w:proofErr w:type="spellEnd"/>
-      <w:r>
-        <w:t xml:space="preserve">, T. S. Sillett, W. D. Koenig, S. A. Morrison, Scatter-hoarding corvids as seed dispersers for oaks and pines: A review of a widely distributed mutualism and its utility to habitat restoration. </w:t>
+        <w:t xml:space="preserve">M. B. Pesendorfer, T. S. Sillett, W. D. Koenig, S. A. Morrison, Scatter-hoarding corvids as seed dispersers for oaks and pines: A review of a widely distributed mutualism and its utility to habitat restoration. </w:t>
       </w:r>
       <w:r>
         <w:rPr>
@@ -13719,23 +13502,7 @@
       </w:r>
       <w:r>
         <w:tab/>
-        <w:t xml:space="preserve">S. B. Vander Wall, </w:t>
-      </w:r>
-      <w:proofErr w:type="gramStart"/>
-      <w:r>
-        <w:t>How</w:t>
-      </w:r>
-      <w:proofErr w:type="gramEnd"/>
-      <w:r>
-        <w:t xml:space="preserve"> plants manipulate the scatter-hoarding </w:t>
-      </w:r>
-      <w:proofErr w:type="spellStart"/>
-      <w:r>
-        <w:t>behaviour</w:t>
-      </w:r>
-      <w:proofErr w:type="spellEnd"/>
-      <w:r>
-        <w:t xml:space="preserve"> of seed-dispersing animals. </w:t>
+        <w:t xml:space="preserve">S. B. Vander Wall, How plants manipulate the scatter-hoarding behaviour of seed-dispersing animals. </w:t>
       </w:r>
       <w:r>
         <w:rPr>
@@ -13821,7 +13588,6 @@
       <w:r>
         <w:t xml:space="preserve">, Reproductive allocation in pulsed-resource environments: a comparative study in two populations of wild boar. </w:t>
       </w:r>
-      <w:proofErr w:type="spellStart"/>
       <w:r>
         <w:rPr>
           <w:i/>
@@ -13829,7 +13595,6 @@
         </w:rPr>
         <w:t>Oecologia</w:t>
       </w:r>
-      <w:proofErr w:type="spellEnd"/>
       <w:r>
         <w:t xml:space="preserve"> </w:t>
       </w:r>
@@ -13860,23 +13625,7 @@
           <w:i/>
           <w:iCs/>
         </w:rPr>
-        <w:t xml:space="preserve">A </w:t>
-      </w:r>
-      <w:proofErr w:type="gramStart"/>
-      <w:r>
-        <w:rPr>
-          <w:i/>
-          <w:iCs/>
-        </w:rPr>
-        <w:t>Sand county</w:t>
-      </w:r>
-      <w:proofErr w:type="gramEnd"/>
-      <w:r>
-        <w:rPr>
-          <w:i/>
-          <w:iCs/>
-        </w:rPr>
-        <w:t xml:space="preserve"> almanac and sketches here and there</w:t>
+        <w:t>A Sand county almanac and sketches here and there</w:t>
       </w:r>
       <w:r>
         <w:t xml:space="preserve"> (OUP, 1949).</w:t>
@@ -13914,41 +13663,15 @@
       </w:r>
       <w:r>
         <w:tab/>
-        <w:t xml:space="preserve">B. </w:t>
-      </w:r>
-      <w:proofErr w:type="spellStart"/>
-      <w:r>
-        <w:t>Sicich</w:t>
-      </w:r>
-      <w:proofErr w:type="spellEnd"/>
-      <w:r>
-        <w:t xml:space="preserve">, A. C. Young, C. S. Bundy, F. Abadi, M. J. Desmond, Open spaces and arthropod abundance are important foraging habitat components for </w:t>
-      </w:r>
-      <w:proofErr w:type="spellStart"/>
-      <w:r>
-        <w:rPr>
-          <w:i/>
-          <w:iCs/>
-        </w:rPr>
-        <w:t>Gymnorhinus</w:t>
-      </w:r>
-      <w:proofErr w:type="spellEnd"/>
-      <w:r>
-        <w:rPr>
-          <w:i/>
-          <w:iCs/>
-        </w:rPr>
-        <w:t xml:space="preserve"> </w:t>
-      </w:r>
-      <w:proofErr w:type="spellStart"/>
-      <w:r>
-        <w:rPr>
-          <w:i/>
-          <w:iCs/>
-        </w:rPr>
-        <w:t>cyanocephalus</w:t>
-      </w:r>
-      <w:proofErr w:type="spellEnd"/>
+        <w:t xml:space="preserve">B. Sicich, A. C. Young, C. S. Bundy, F. Abadi, M. J. Desmond, Open spaces and arthropod abundance are important foraging habitat components for </w:t>
+      </w:r>
+      <w:r>
+        <w:rPr>
+          <w:i/>
+          <w:iCs/>
+        </w:rPr>
+        <w:t>Gymnorhinus cyanocephalus</w:t>
+      </w:r>
       <w:r>
         <w:t xml:space="preserve"> (Pinyon Jay) in south-central New Mexico. </w:t>
       </w:r>
@@ -14014,15 +13737,7 @@
         <w:t>et al.</w:t>
       </w:r>
       <w:r>
-        <w:t xml:space="preserve">, </w:t>
-      </w:r>
-      <w:proofErr w:type="gramStart"/>
-      <w:r>
-        <w:t>Regional</w:t>
-      </w:r>
-      <w:proofErr w:type="gramEnd"/>
-      <w:r>
-        <w:t xml:space="preserve"> vegetation die-off in response to global-change-type drought. </w:t>
+        <w:t xml:space="preserve">, Regional vegetation die-off in response to global-change-type drought. </w:t>
       </w:r>
       <w:r>
         <w:rPr>
@@ -14054,15 +13769,7 @@
       </w:r>
       <w:r>
         <w:tab/>
-        <w:t xml:space="preserve">A. J. H. </w:t>
-      </w:r>
-      <w:proofErr w:type="spellStart"/>
-      <w:r>
-        <w:t>Meddens</w:t>
-      </w:r>
-      <w:proofErr w:type="spellEnd"/>
-      <w:r>
-        <w:t xml:space="preserve">, </w:t>
+        <w:t xml:space="preserve">A. J. H. Meddens, </w:t>
       </w:r>
       <w:r>
         <w:rPr>
@@ -14104,15 +13811,7 @@
       </w:r>
       <w:r>
         <w:tab/>
-        <w:t xml:space="preserve">M. D. Redmond, F. Forcella, N. N. Barger, Declines in pinyon </w:t>
-      </w:r>
-      <w:proofErr w:type="gramStart"/>
-      <w:r>
-        <w:t>pine cone</w:t>
-      </w:r>
-      <w:proofErr w:type="gramEnd"/>
-      <w:r>
-        <w:t xml:space="preserve"> production associated with regional warming. </w:t>
+        <w:t xml:space="preserve">M. D. Redmond, F. Forcella, N. N. Barger, Declines in pinyon pine cone production associated with regional warming. </w:t>
       </w:r>
       <w:r>
         <w:rPr>
@@ -14154,15 +13853,7 @@
         <w:t>et al.</w:t>
       </w:r>
       <w:r>
-        <w:t xml:space="preserve">, Positive Drought </w:t>
-      </w:r>
-      <w:proofErr w:type="gramStart"/>
-      <w:r>
-        <w:t>Feedbacks</w:t>
-      </w:r>
-      <w:proofErr w:type="gramEnd"/>
-      <w:r>
-        <w:t xml:space="preserve"> Increase Tree Mortality Risk in Dry Woodlands of the </w:t>
+        <w:t xml:space="preserve">, Positive Drought Feedbacks Increase Tree Mortality Risk in Dry Woodlands of the </w:t>
       </w:r>
       <w:r>
         <w:rPr>
@@ -14203,48 +13894,15 @@
       </w:r>
       <w:r>
         <w:tab/>
-        <w:t xml:space="preserve">R. K. Shriver, C. B. Yackulic, D. M. Bell, J. B. Bradford, </w:t>
-      </w:r>
-      <w:proofErr w:type="gramStart"/>
-      <w:r>
-        <w:t>Dry forest</w:t>
-      </w:r>
-      <w:proofErr w:type="gramEnd"/>
-      <w:r>
-        <w:t xml:space="preserve"> decline is driven by both declining recruitment and increasing mortality in response to warm, dry conditions. </w:t>
-      </w:r>
-      <w:r>
-        <w:rPr>
-          <w:i/>
-          <w:iCs/>
-        </w:rPr>
-        <w:t xml:space="preserve">Global </w:t>
-      </w:r>
-      <w:proofErr w:type="spellStart"/>
-      <w:r>
-        <w:rPr>
-          <w:i/>
-          <w:iCs/>
-        </w:rPr>
-        <w:t>Ecol</w:t>
-      </w:r>
-      <w:proofErr w:type="spellEnd"/>
-      <w:r>
-        <w:rPr>
-          <w:i/>
-          <w:iCs/>
-        </w:rPr>
-        <w:t xml:space="preserve"> </w:t>
-      </w:r>
-      <w:proofErr w:type="spellStart"/>
-      <w:r>
-        <w:rPr>
-          <w:i/>
-          <w:iCs/>
-        </w:rPr>
-        <w:t>Biogeogr</w:t>
-      </w:r>
-      <w:proofErr w:type="spellEnd"/>
+        <w:t xml:space="preserve">R. K. Shriver, C. B. Yackulic, D. M. Bell, J. B. Bradford, Dry forest decline is driven by both declining recruitment and increasing mortality in response to warm, dry conditions. </w:t>
+      </w:r>
+      <w:r>
+        <w:rPr>
+          <w:i/>
+          <w:iCs/>
+        </w:rPr>
+        <w:t>Global Ecol Biogeogr</w:t>
+      </w:r>
       <w:r>
         <w:t xml:space="preserve"> </w:t>
       </w:r>
@@ -14332,15 +13990,7 @@
       </w:r>
       <w:r>
         <w:tab/>
-        <w:t xml:space="preserve">J. J. </w:t>
-      </w:r>
-      <w:proofErr w:type="spellStart"/>
-      <w:r>
-        <w:t>Foest</w:t>
-      </w:r>
-      <w:proofErr w:type="spellEnd"/>
-      <w:r>
-        <w:t xml:space="preserve">, </w:t>
+        <w:t xml:space="preserve">J. J. Foest, </w:t>
       </w:r>
       <w:r>
         <w:rPr>
@@ -14382,15 +14032,7 @@
       </w:r>
       <w:r>
         <w:tab/>
-        <w:t xml:space="preserve">W. J. </w:t>
-      </w:r>
-      <w:proofErr w:type="spellStart"/>
-      <w:r>
-        <w:t>Mcshea</w:t>
-      </w:r>
-      <w:proofErr w:type="spellEnd"/>
-      <w:r>
-        <w:t xml:space="preserve">, </w:t>
+        <w:t xml:space="preserve">W. J. Mcshea, </w:t>
       </w:r>
       <w:r>
         <w:rPr>
@@ -14407,23 +14049,7 @@
           <w:i/>
           <w:iCs/>
         </w:rPr>
-        <w:t xml:space="preserve">J </w:t>
-      </w:r>
-      <w:proofErr w:type="spellStart"/>
-      <w:r>
-        <w:rPr>
-          <w:i/>
-          <w:iCs/>
-        </w:rPr>
-        <w:t>Wildl</w:t>
-      </w:r>
-      <w:proofErr w:type="spellEnd"/>
-      <w:r>
-        <w:rPr>
-          <w:i/>
-          <w:iCs/>
-        </w:rPr>
-        <w:t xml:space="preserve"> Manag</w:t>
+        <w:t>J Wildl Manag</w:t>
       </w:r>
       <w:r>
         <w:t xml:space="preserve"> </w:t>
@@ -14671,15 +14297,7 @@
       </w:r>
       <w:r>
         <w:tab/>
-        <w:t xml:space="preserve">J. M. </w:t>
-      </w:r>
-      <w:proofErr w:type="spellStart"/>
-      <w:r>
-        <w:t>Marzluff</w:t>
-      </w:r>
-      <w:proofErr w:type="spellEnd"/>
-      <w:r>
-        <w:t xml:space="preserve">, R. P. Balda, The Advantages of, and Constraints Forcing, Mate Fidelity in Pinyon Jays. </w:t>
+        <w:t xml:space="preserve">J. M. Marzluff, R. P. Balda, The Advantages of, and Constraints Forcing, Mate Fidelity in Pinyon Jays. </w:t>
       </w:r>
       <w:r>
         <w:rPr>
@@ -14711,14 +14329,7 @@
       </w:r>
       <w:r>
         <w:tab/>
-      </w:r>
-      <w:proofErr w:type="spellStart"/>
-      <w:r>
-        <w:t>Marzluff</w:t>
-      </w:r>
-      <w:proofErr w:type="spellEnd"/>
-      <w:r>
-        <w:t xml:space="preserve">, R. P. Balda, </w:t>
+        <w:t xml:space="preserve">Marzluff, R. P. Balda, </w:t>
       </w:r>
       <w:r>
         <w:rPr>
@@ -14742,7 +14353,6 @@
         <w:tab/>
         <w:t xml:space="preserve">A. P. Wion, P. J. Weisberg, I. S. Pearse, M. D. Redmond, Aridity drives spatiotemporal patterns of masting across the latitudinal range of a dryland conifer. </w:t>
       </w:r>
-      <w:proofErr w:type="spellStart"/>
       <w:r>
         <w:rPr>
           <w:i/>
@@ -14750,7 +14360,6 @@
         </w:rPr>
         <w:t>Ecography</w:t>
       </w:r>
-      <w:proofErr w:type="spellEnd"/>
       <w:r>
         <w:t xml:space="preserve"> </w:t>
       </w:r>
@@ -14774,15 +14383,7 @@
       </w:r>
       <w:r>
         <w:tab/>
-        <w:t xml:space="preserve">R. R. Parmenter, R. I. </w:t>
-      </w:r>
-      <w:proofErr w:type="spellStart"/>
-      <w:r>
-        <w:t>Zlotin</w:t>
-      </w:r>
-      <w:proofErr w:type="spellEnd"/>
-      <w:r>
-        <w:t xml:space="preserve">, D. I. Moore, O. B. Myers, Environmental and endogenous drivers of tree mast production and synchrony in piñon–juniper–oak woodlands of New Mexico. </w:t>
+        <w:t xml:space="preserve">R. R. Parmenter, R. I. Zlotin, D. I. Moore, O. B. Myers, Environmental and endogenous drivers of tree mast production and synchrony in piñon–juniper–oak woodlands of New Mexico. </w:t>
       </w:r>
       <w:r>
         <w:rPr>
@@ -14816,7 +14417,6 @@
         <w:tab/>
         <w:t xml:space="preserve">D. H. Branson, Influence of a Large Late Summer Precipitation Event on Food Limitation and Grasshopper Population Dynamics in a Northern Great Plains Grassland. </w:t>
       </w:r>
-      <w:proofErr w:type="spellStart"/>
       <w:r>
         <w:rPr>
           <w:i/>
@@ -14824,7 +14424,6 @@
         </w:rPr>
         <w:t>en</w:t>
       </w:r>
-      <w:proofErr w:type="spellEnd"/>
       <w:r>
         <w:t xml:space="preserve"> </w:t>
       </w:r>
@@ -14848,15 +14447,7 @@
       </w:r>
       <w:r>
         <w:tab/>
-        <w:t xml:space="preserve">P. Bergeron, D. </w:t>
-      </w:r>
-      <w:proofErr w:type="spellStart"/>
-      <w:r>
-        <w:t>Réale</w:t>
-      </w:r>
-      <w:proofErr w:type="spellEnd"/>
-      <w:r>
-        <w:t xml:space="preserve">, M. M. Humphries, D. Garant, Anticipation and tracking of pulsed resources drive population dynamics in eastern chipmunks. </w:t>
+        <w:t xml:space="preserve">P. Bergeron, D. Réale, M. M. Humphries, D. Garant, Anticipation and tracking of pulsed resources drive population dynamics in eastern chipmunks. </w:t>
       </w:r>
       <w:r>
         <w:rPr>
@@ -14888,54 +14479,14 @@
       </w:r>
       <w:r>
         <w:tab/>
-        <w:t xml:space="preserve">J. Fietz, T. Kager, S. Schauer, </w:t>
-      </w:r>
-      <w:proofErr w:type="gramStart"/>
-      <w:r>
-        <w:t>Is</w:t>
-      </w:r>
-      <w:proofErr w:type="gramEnd"/>
-      <w:r>
-        <w:t xml:space="preserve"> energy supply the trigger for reproductive activity in male edible dormice (</w:t>
-      </w:r>
-      <w:proofErr w:type="spellStart"/>
-      <w:r>
-        <w:t>Glis</w:t>
-      </w:r>
-      <w:proofErr w:type="spellEnd"/>
-      <w:r>
-        <w:t xml:space="preserve"> </w:t>
-      </w:r>
-      <w:proofErr w:type="spellStart"/>
-      <w:r>
-        <w:t>glis</w:t>
-      </w:r>
-      <w:proofErr w:type="spellEnd"/>
-      <w:r>
-        <w:t xml:space="preserve">)? </w:t>
-      </w:r>
-      <w:r>
-        <w:rPr>
-          <w:i/>
-          <w:iCs/>
-        </w:rPr>
-        <w:t xml:space="preserve">J Comp </w:t>
-      </w:r>
-      <w:proofErr w:type="spellStart"/>
-      <w:r>
-        <w:rPr>
-          <w:i/>
-          <w:iCs/>
-        </w:rPr>
-        <w:t>Physiol</w:t>
-      </w:r>
-      <w:proofErr w:type="spellEnd"/>
-      <w:r>
-        <w:rPr>
-          <w:i/>
-          <w:iCs/>
-        </w:rPr>
-        <w:t xml:space="preserve"> B</w:t>
+        <w:t xml:space="preserve">J. Fietz, T. Kager, S. Schauer, Is energy supply the trigger for reproductive activity in male edible dormice (Glis glis)? </w:t>
+      </w:r>
+      <w:r>
+        <w:rPr>
+          <w:i/>
+          <w:iCs/>
+        </w:rPr>
+        <w:t>J Comp Physiol B</w:t>
       </w:r>
       <w:r>
         <w:t xml:space="preserve"> </w:t>
@@ -14992,15 +14543,7 @@
       </w:r>
       <w:r>
         <w:tab/>
-        <w:t xml:space="preserve">J. L. Schnurr, R. S. </w:t>
-      </w:r>
-      <w:proofErr w:type="spellStart"/>
-      <w:r>
-        <w:t>Ostfeld</w:t>
-      </w:r>
-      <w:proofErr w:type="spellEnd"/>
-      <w:r>
-        <w:t xml:space="preserve">, C. D. Canham, Direct and indirect effects of masting on rodent populations and tree seed survival. </w:t>
+        <w:t xml:space="preserve">J. L. Schnurr, R. S. Ostfeld, C. D. Canham, Direct and indirect effects of masting on rodent populations and tree seed survival. </w:t>
       </w:r>
       <w:r>
         <w:rPr>
@@ -15033,25 +14576,8 @@
       </w:r>
       <w:r>
         <w:tab/>
-        <w:t xml:space="preserve">V. </w:t>
-      </w:r>
-      <w:proofErr w:type="spellStart"/>
-      <w:r>
-        <w:t>Selonen</w:t>
-      </w:r>
-      <w:proofErr w:type="spellEnd"/>
-      <w:r>
-        <w:t xml:space="preserve">, R. Varjonen, E. </w:t>
-      </w:r>
-      <w:proofErr w:type="spellStart"/>
-      <w:r>
-        <w:t>Korpimäki</w:t>
-      </w:r>
-      <w:proofErr w:type="spellEnd"/>
-      <w:r>
-        <w:t xml:space="preserve">, Immediate or lagged responses of a red squirrel population to pulsed resources. </w:t>
-      </w:r>
-      <w:proofErr w:type="spellStart"/>
+        <w:t xml:space="preserve">V. Selonen, R. Varjonen, E. Korpimäki, Immediate or lagged responses of a red squirrel population to pulsed resources. </w:t>
+      </w:r>
       <w:r>
         <w:rPr>
           <w:i/>
@@ -15059,7 +14585,6 @@
         </w:rPr>
         <w:t>Oecologia</w:t>
       </w:r>
-      <w:proofErr w:type="spellEnd"/>
       <w:r>
         <w:t xml:space="preserve"> </w:t>
       </w:r>
@@ -15083,40 +14608,15 @@
       </w:r>
       <w:r>
         <w:tab/>
-        <w:t xml:space="preserve">J. M. </w:t>
-      </w:r>
-      <w:proofErr w:type="spellStart"/>
-      <w:r>
-        <w:t>Marzluff</w:t>
-      </w:r>
-      <w:proofErr w:type="spellEnd"/>
-      <w:r>
-        <w:t xml:space="preserve">, </w:t>
-      </w:r>
-      <w:proofErr w:type="gramStart"/>
-      <w:r>
-        <w:t>Do</w:t>
-      </w:r>
-      <w:proofErr w:type="gramEnd"/>
-      <w:r>
-        <w:t xml:space="preserve"> pinyon jays alter nest placement based on prior experience? </w:t>
-      </w:r>
-      <w:r>
-        <w:rPr>
-          <w:i/>
-          <w:iCs/>
-        </w:rPr>
-        <w:t xml:space="preserve">Animal </w:t>
-      </w:r>
-      <w:proofErr w:type="spellStart"/>
-      <w:r>
-        <w:rPr>
-          <w:i/>
-          <w:iCs/>
-        </w:rPr>
-        <w:t>Behaviour</w:t>
-      </w:r>
-      <w:proofErr w:type="spellEnd"/>
+        <w:t xml:space="preserve">J. M. Marzluff, Do pinyon jays alter nest placement based on prior experience? </w:t>
+      </w:r>
+      <w:r>
+        <w:rPr>
+          <w:i/>
+          <w:iCs/>
+        </w:rPr>
+        <w:t>Animal Behaviour</w:t>
+      </w:r>
       <w:r>
         <w:t xml:space="preserve"> </w:t>
       </w:r>
@@ -15226,31 +14726,7 @@
       </w:r>
       <w:r>
         <w:tab/>
-        <w:t xml:space="preserve">C. A. </w:t>
-      </w:r>
-      <w:proofErr w:type="spellStart"/>
-      <w:r>
-        <w:t>Bahlai</w:t>
-      </w:r>
-      <w:proofErr w:type="spellEnd"/>
-      <w:r>
-        <w:t xml:space="preserve">, E. R. White, J. D. Perrone, S. </w:t>
-      </w:r>
-      <w:proofErr w:type="spellStart"/>
-      <w:r>
-        <w:t>Cusser</w:t>
-      </w:r>
-      <w:proofErr w:type="spellEnd"/>
-      <w:r>
-        <w:t xml:space="preserve">, K. Stack Whitney, </w:t>
-      </w:r>
-      <w:proofErr w:type="gramStart"/>
-      <w:r>
-        <w:t>The</w:t>
-      </w:r>
-      <w:proofErr w:type="gramEnd"/>
-      <w:r>
-        <w:t xml:space="preserve"> broken window: An algorithm for quantifying and characterizing misleading trajectories in ecological processes. </w:t>
+        <w:t xml:space="preserve">C. A. Bahlai, E. R. White, J. D. Perrone, S. Cusser, K. Stack Whitney, The broken window: An algorithm for quantifying and characterizing misleading trajectories in ecological processes. </w:t>
       </w:r>
       <w:r>
         <w:rPr>
@@ -15282,15 +14758,7 @@
       </w:r>
       <w:r>
         <w:tab/>
-        <w:t xml:space="preserve">M. Bogdziewicz, R. Zwolak, E. E. Crone, </w:t>
-      </w:r>
-      <w:proofErr w:type="gramStart"/>
-      <w:r>
-        <w:t>How</w:t>
-      </w:r>
-      <w:proofErr w:type="gramEnd"/>
-      <w:r>
-        <w:t xml:space="preserve"> do vertebrates respond to mast seeding? </w:t>
+        <w:t xml:space="preserve">M. Bogdziewicz, R. Zwolak, E. E. Crone, How do vertebrates respond to mast seeding? </w:t>
       </w:r>
       <w:r>
         <w:rPr>
@@ -15322,23 +14790,7 @@
       </w:r>
       <w:r>
         <w:tab/>
-        <w:t xml:space="preserve">R. S. </w:t>
-      </w:r>
-      <w:proofErr w:type="spellStart"/>
-      <w:r>
-        <w:t>Ostfeld</w:t>
-      </w:r>
-      <w:proofErr w:type="spellEnd"/>
-      <w:r>
-        <w:t xml:space="preserve">, F. </w:t>
-      </w:r>
-      <w:proofErr w:type="spellStart"/>
-      <w:r>
-        <w:t>Keesing</w:t>
-      </w:r>
-      <w:proofErr w:type="spellEnd"/>
-      <w:r>
-        <w:t xml:space="preserve">, Pulsed resources and community dynamics of consumers in terrestrial ecosystems. </w:t>
+        <w:t xml:space="preserve">R. S. Ostfeld, F. Keesing, Pulsed resources and community dynamics of consumers in terrestrial ecosystems. </w:t>
       </w:r>
       <w:r>
         <w:rPr>
@@ -15370,23 +14822,7 @@
       </w:r>
       <w:r>
         <w:tab/>
-        <w:t xml:space="preserve">C. </w:t>
-      </w:r>
-      <w:proofErr w:type="spellStart"/>
-      <w:r>
-        <w:t>Bregnard</w:t>
-      </w:r>
-      <w:proofErr w:type="spellEnd"/>
-      <w:r>
-        <w:t xml:space="preserve">, O. Rais, M. J. </w:t>
-      </w:r>
-      <w:proofErr w:type="spellStart"/>
-      <w:r>
-        <w:t>Voordouw</w:t>
-      </w:r>
-      <w:proofErr w:type="spellEnd"/>
-      <w:r>
-        <w:t xml:space="preserve">, Masting by beech trees predicts the risk of Lyme disease. </w:t>
+        <w:t xml:space="preserve">C. Bregnard, O. Rais, M. J. Voordouw, Masting by beech trees predicts the risk of Lyme disease. </w:t>
       </w:r>
       <w:r>
         <w:rPr>
@@ -15428,15 +14864,7 @@
         <w:t>et al.</w:t>
       </w:r>
       <w:r>
-        <w:t xml:space="preserve">, </w:t>
-      </w:r>
-      <w:proofErr w:type="gramStart"/>
-      <w:r>
-        <w:t>Downsizing</w:t>
-      </w:r>
-      <w:proofErr w:type="gramEnd"/>
-      <w:r>
-        <w:t xml:space="preserve"> of animal communities triggers stronger functional than structural decay in seed-dispersal networks. </w:t>
+        <w:t xml:space="preserve">, Downsizing of animal communities triggers stronger functional than structural decay in seed-dispersal networks. </w:t>
       </w:r>
       <w:r>
         <w:rPr>
@@ -15480,7 +14908,6 @@
       <w:r>
         <w:t xml:space="preserve">, The influence of interspecific interactions on species range expansion rates. </w:t>
       </w:r>
-      <w:proofErr w:type="spellStart"/>
       <w:r>
         <w:rPr>
           <w:i/>
@@ -15488,7 +14915,6 @@
         </w:rPr>
         <w:t>Ecography</w:t>
       </w:r>
-      <w:proofErr w:type="spellEnd"/>
       <w:r>
         <w:t xml:space="preserve"> </w:t>
       </w:r>
@@ -15512,23 +14938,7 @@
       </w:r>
       <w:r>
         <w:tab/>
-        <w:t xml:space="preserve">J. M. Tylianakis, R. K. </w:t>
-      </w:r>
-      <w:proofErr w:type="spellStart"/>
-      <w:r>
-        <w:t>Didham</w:t>
-      </w:r>
-      <w:proofErr w:type="spellEnd"/>
-      <w:r>
-        <w:t xml:space="preserve">, J. </w:t>
-      </w:r>
-      <w:proofErr w:type="spellStart"/>
-      <w:r>
-        <w:t>Bascompte</w:t>
-      </w:r>
-      <w:proofErr w:type="spellEnd"/>
-      <w:r>
-        <w:t xml:space="preserve">, D. A. Wardle, Global change and species interactions in terrestrial ecosystems. </w:t>
+        <w:t xml:space="preserve">J. M. Tylianakis, R. K. Didham, J. Bascompte, D. A. Wardle, Global change and species interactions in terrestrial ecosystems. </w:t>
       </w:r>
       <w:r>
         <w:rPr>
@@ -15722,35 +15132,59 @@
         <w:t>et al.</w:t>
       </w:r>
       <w:r>
+        <w:t xml:space="preserve">, Using citizen science data in integrated population models to inform conservation. </w:t>
+      </w:r>
+      <w:r>
+        <w:rPr>
+          <w:i/>
+          <w:iCs/>
+        </w:rPr>
+        <w:t>Biological Conservation</w:t>
+      </w:r>
+      <w:r>
+        <w:t xml:space="preserve"> </w:t>
+      </w:r>
+      <w:r>
+        <w:rPr>
+          <w:b/>
+          <w:bCs/>
+        </w:rPr>
+        <w:t>227</w:t>
+      </w:r>
+      <w:r>
+        <w:t>, 361–368 (2018).</w:t>
+      </w:r>
+    </w:p>
+    <w:p>
+      <w:pPr>
+        <w:pStyle w:val="Bibliography"/>
+      </w:pPr>
+      <w:r>
+        <w:t xml:space="preserve">84. </w:t>
+      </w:r>
+      <w:r>
+        <w:tab/>
+        <w:t xml:space="preserve">M. Strimas-Mackey, </w:t>
+      </w:r>
+      <w:r>
+        <w:rPr>
+          <w:i/>
+          <w:iCs/>
+        </w:rPr>
+        <w:t>et al.</w:t>
+      </w:r>
+      <w:r>
         <w:t xml:space="preserve">, </w:t>
       </w:r>
-      <w:proofErr w:type="gramStart"/>
-      <w:r>
-        <w:t>Using</w:t>
-      </w:r>
-      <w:proofErr w:type="gramEnd"/>
-      <w:r>
-        <w:t xml:space="preserve"> citizen science data in integrated population models to inform conservation. </w:t>
-      </w:r>
-      <w:r>
-        <w:rPr>
-          <w:i/>
-          <w:iCs/>
-        </w:rPr>
-        <w:t>Biological Conservation</w:t>
-      </w:r>
-      <w:r>
-        <w:t xml:space="preserve"> </w:t>
-      </w:r>
-      <w:r>
-        <w:rPr>
-          <w:b/>
-          <w:bCs/>
-        </w:rPr>
-        <w:t>227</w:t>
-      </w:r>
-      <w:r>
-        <w:t>, 361–368 (2018).</w:t>
+      <w:r>
+        <w:rPr>
+          <w:i/>
+          <w:iCs/>
+        </w:rPr>
+        <w:t>Best Practices for Using eBird Data</w:t>
+      </w:r>
+      <w:r>
+        <w:t xml:space="preserve"> (Cornell Lab of Ornithology, 2023).</w:t>
       </w:r>
     </w:p>
     <w:p>
@@ -15758,67 +15192,11 @@
         <w:pStyle w:val="Bibliography"/>
       </w:pPr>
       <w:r>
-        <w:t xml:space="preserve">84. </w:t>
+        <w:t xml:space="preserve">85. </w:t>
       </w:r>
       <w:r>
         <w:tab/>
-        <w:t xml:space="preserve">M. </w:t>
-      </w:r>
-      <w:proofErr w:type="spellStart"/>
-      <w:r>
-        <w:t>Strimas</w:t>
-      </w:r>
-      <w:proofErr w:type="spellEnd"/>
-      <w:r>
-        <w:t xml:space="preserve">-Mackey, </w:t>
-      </w:r>
-      <w:r>
-        <w:rPr>
-          <w:i/>
-          <w:iCs/>
-        </w:rPr>
-        <w:t>et al.</w:t>
-      </w:r>
-      <w:r>
-        <w:t xml:space="preserve">, </w:t>
-      </w:r>
-      <w:r>
-        <w:rPr>
-          <w:i/>
-          <w:iCs/>
-        </w:rPr>
-        <w:t>Best Practices for Using eBird Data</w:t>
-      </w:r>
-      <w:r>
-        <w:t xml:space="preserve"> (Cornell Lab of Ornithology, 2023).</w:t>
-      </w:r>
-    </w:p>
-    <w:p>
-      <w:pPr>
-        <w:pStyle w:val="Bibliography"/>
-      </w:pPr>
-      <w:r>
-        <w:t xml:space="preserve">85. </w:t>
-      </w:r>
-      <w:r>
-        <w:tab/>
-        <w:t>D. A. Wiggins, “Pinyon Jay (</w:t>
-      </w:r>
-      <w:proofErr w:type="spellStart"/>
-      <w:r>
-        <w:t>Gymnorhinus</w:t>
-      </w:r>
-      <w:proofErr w:type="spellEnd"/>
-      <w:r>
-        <w:t xml:space="preserve"> </w:t>
-      </w:r>
-      <w:proofErr w:type="spellStart"/>
-      <w:r>
-        <w:t>cyanocephalus</w:t>
-      </w:r>
-      <w:proofErr w:type="spellEnd"/>
-      <w:r>
-        <w:t>): a technical conservation assessment.” (USDA Forest Service, Rocky Mountain Region, 2005).</w:t>
+        <w:t>D. A. Wiggins, “Pinyon Jay (Gymnorhinus cyanocephalus): a technical conservation assessment.” (USDA Forest Service, Rocky Mountain Region, 2005).</w:t>
       </w:r>
     </w:p>
     <w:p>
@@ -15854,15 +15232,7 @@
       </w:r>
       <w:r>
         <w:tab/>
-        <w:t xml:space="preserve">W. D. Shepperd, C. B. Edminster, S. A. Mata, Long-Term </w:t>
-      </w:r>
-      <w:proofErr w:type="spellStart"/>
-      <w:r>
-        <w:t>Seedfall</w:t>
-      </w:r>
-      <w:proofErr w:type="spellEnd"/>
-      <w:r>
-        <w:t xml:space="preserve">, Establishment, Survival, and Growth of Natural and Planted Ponderosa Pine in the Colorado Front Range. </w:t>
+        <w:t xml:space="preserve">W. D. Shepperd, C. B. Edminster, S. A. Mata, Long-Term Seedfall, Establishment, Survival, and Growth of Natural and Planted Ponderosa Pine in the Colorado Front Range. </w:t>
       </w:r>
       <w:r>
         <w:rPr>
@@ -15911,23 +15281,7 @@
           <w:i/>
           <w:iCs/>
         </w:rPr>
-        <w:t xml:space="preserve">Methods </w:t>
-      </w:r>
-      <w:proofErr w:type="spellStart"/>
-      <w:r>
-        <w:rPr>
-          <w:i/>
-          <w:iCs/>
-        </w:rPr>
-        <w:t>Ecol</w:t>
-      </w:r>
-      <w:proofErr w:type="spellEnd"/>
-      <w:r>
-        <w:rPr>
-          <w:i/>
-          <w:iCs/>
-        </w:rPr>
-        <w:t xml:space="preserve"> Evol</w:t>
+        <w:t>Methods Ecol Evol</w:t>
       </w:r>
       <w:r>
         <w:t xml:space="preserve"> </w:t>
@@ -15984,38 +15338,14 @@
       </w:r>
       <w:r>
         <w:tab/>
-        <w:t xml:space="preserve">R. </w:t>
-      </w:r>
-      <w:proofErr w:type="spellStart"/>
-      <w:r>
-        <w:t>Michalet</w:t>
-      </w:r>
-      <w:proofErr w:type="spellEnd"/>
-      <w:r>
-        <w:t xml:space="preserve">, P. Choler, R. M. Callaway, T. G. Whitham, Rainfall continentality, via the winter Gams angle, provides a new dimension to biogeographical distributions in the western United States. </w:t>
-      </w:r>
-      <w:r>
-        <w:rPr>
-          <w:i/>
-          <w:iCs/>
-        </w:rPr>
-        <w:t xml:space="preserve">Global Ecol. </w:t>
-      </w:r>
-      <w:proofErr w:type="spellStart"/>
-      <w:r>
-        <w:rPr>
-          <w:i/>
-          <w:iCs/>
-        </w:rPr>
-        <w:t>Biogeogr</w:t>
-      </w:r>
-      <w:proofErr w:type="spellEnd"/>
-      <w:r>
-        <w:rPr>
-          <w:i/>
-          <w:iCs/>
-        </w:rPr>
-        <w:t>.</w:t>
+        <w:t xml:space="preserve">R. Michalet, P. Choler, R. M. Callaway, T. G. Whitham, Rainfall continentality, via the winter Gams angle, provides a new dimension to biogeographical distributions in the western United States. </w:t>
+      </w:r>
+      <w:r>
+        <w:rPr>
+          <w:i/>
+          <w:iCs/>
+        </w:rPr>
+        <w:t>Global Ecol. Biogeogr.</w:t>
       </w:r>
       <w:r>
         <w:t xml:space="preserve"> </w:t>
@@ -16179,15 +15509,7 @@
       </w:r>
       <w:r>
         <w:tab/>
-        <w:t xml:space="preserve">W. M. </w:t>
-      </w:r>
-      <w:proofErr w:type="spellStart"/>
-      <w:r>
-        <w:t>Hochachka</w:t>
-      </w:r>
-      <w:proofErr w:type="spellEnd"/>
-      <w:r>
-        <w:t xml:space="preserve">, V. Ruiz-Gutierrez, A. Johnston, Considerations for fitting occupancy models to data from eBird and similar volunteer-collected data. </w:t>
+        <w:t xml:space="preserve">W. M. Hochachka, V. Ruiz-Gutierrez, A. Johnston, Considerations for fitting occupancy models to data from eBird and similar volunteer-collected data. </w:t>
       </w:r>
       <w:r>
         <w:rPr>

</xml_diff>